<commit_message>
docs: capture grilled design decisions
</commit_message>
<xml_diff>
--- a/Global-Rate-Limiter-Architecture-Documentation.docx
+++ b/Global-Rate-Limiter-Architecture-Documentation.docx
@@ -636,7 +636,7 @@
           </w:tcPr>
           <w:p>
             <w:r>
-              <w:t xml:space="preserve">Stored in Redis (client_limits:{id}, api_keys:{key} → client_id)</w:t>
+              <w:t>Stored in Redis (client_limits:{id}, api_keys: sha256(key) → client_id)</w:t>
             </w:r>
           </w:p>
         </w:tc>
@@ -646,7 +646,7 @@
           </w:tcPr>
           <w:p>
             <w:r>
-              <w:t xml:space="preserve">Keeps a single source of truth: the same store already governs GCRA state, so an admin write via PUT /admin/clients/{id}/limits is instantly visible to all rate-limiter replicas on their very next check — no config file, no cache invalidation, no redeploy, no second system to keep in sync.</w:t>
+              <w:t>Keeps a single source of truth: the same store already governs GCRA state, so an admin write via PUT /admin/clients/{id}/limits is instantly visible to all rate-limiter replicas on their very next check — no config file, no cache invalidation, no redeploy, no second system to keep in sync. Client API keys are stored as SHA-256 hashes (never plaintext), so a Redis dump or AOF file contains no recoverable client secrets.</w:t>
             </w:r>
           </w:p>
         </w:tc>
@@ -678,7 +678,7 @@
           </w:tcPr>
           <w:p>
             <w:r>
-              <w:t xml:space="preserve">Adds zero new infrastructure (Redis is already running for GCRA), while fully decoupling the billing/analytics write from the latency-critical check path. A background consumer in the control-plane service drains the stream asynchronously, so logging can never slow down /check.</w:t>
+              <w:t>Adds zero new infrastructure (Redis is already running for GCRA), while fully decoupling the billing/analytics write from the latency-critical check path. A background consumer in the control-plane service drains the stream asynchronously, so logging can never slow down /check. Delivery is at-least-once via consumer groups; the consumer writes idempotently (ON CONFLICT (event_id) DO NOTHING, keyed on the stream entry ID) and XACKs after the write, so a crash between the write and the XACK cannot create duplicate billing rows.</w:t>
             </w:r>
           </w:p>
         </w:tc>
@@ -827,7 +827,7 @@
           </w:tcPr>
           <w:p>
             <w:r>
-              <w:t xml:space="preserve">The requirement is explicit: a database/cache outage must not block all traffic. Plain fail-open satisfies the literal requirement but loses all rate limiting during an outage — the exact over-quota / financial-penalty scenario the brief opens with. A local, per-instance token-bucket fallback (consulted only once Redis is confirmed unreachable via a circuit breaker) keeps limiting active in a degraded, best-effort mode rather than disabling it entirely, and is surfaced to callers via an X-RateLimit-Degraded response header so the degraded state is observable, not silent.</w:t>
+              <w:t>The requirement is explicit: a database/cache outage must not block all traffic. Plain fail-open satisfies the literal requirement but loses all rate limiting during an outage — the exact over-quota / financial-penalty scenario the brief opens with. A local, per-instance token-bucket fallback (consulted only once Redis is confirmed unreachable via a circuit breaker) keeps limiting active in a degraded, best-effort mode rather than disabling it entirely, and is surfaced to callers via an X-RateLimit-Degraded response header so the degraded state is observable, not silent. The fallback is a per-replica token bucket seeded from each replica's cached last-known per-client limits (limits and the key-to-client map refresh on every successful Redis round trip); it trips after 3 consecutive check-path Redis failures and recovers after 1 success. Because each replica runs its own bucket, the fleet may admit up to ~3x a client's configured burst during an outage - a bounded, documented consequence of fail-open.</w:t>
             </w:r>
           </w:p>
         </w:tc>
@@ -860,6 +860,38 @@
           <w:p>
             <w:r>
               <w:t xml:space="preserve">Connecting directly to a fixed master hostname defeats the purpose of Sentinel: after a failover, that hostname would point at a dead node. A Sentinel-aware client asks the sentinels for the current primary and reconnects automatically on failover, which is the piece of application code that actually makes the 3-sentinel decision meaningful rather than cosmetic.</w:t>
+            </w:r>
+          </w:p>
+        </w:tc>
+      </w:tr>
+      <w:tr>
+        <w:tc>
+          <w:tcPr>
+            <w:tcW w:type="dxa" w:w="2200"/>
+          </w:tcPr>
+          <w:p>
+            <w:r>
+              <w:t>Failover write-loss</w:t>
+            </w:r>
+          </w:p>
+        </w:tc>
+        <w:tc>
+          <w:tcPr>
+            <w:tcW w:type="dxa" w:w="3400"/>
+          </w:tcPr>
+          <w:p>
+            <w:r>
+              <w:t>Accepted: no min-replicas-to-write; GCRA state loss on failover is bounded and acceptable</w:t>
+            </w:r>
+          </w:p>
+        </w:tc>
+        <w:tc>
+          <w:tcPr>
+            <w:tcW w:type="dxa" w:w="3760"/>
+          </w:tcPr>
+          <w:p>
+            <w:r>
+              <w:t>Replication is async, so a failover can lose the primary's last few seconds of acknowledged writes. Forcing min-replicas-to-write 1 would protect GCRA state - the one thing the design declares expendable (it simply resets to a fresh bucket) - at the cost of replica-ack latency on every check and degraded mode whenever the single replica is down. The brief over-admission window on failover is therefore accepted and documented. AOF runs on every node (including the promoted replica) so client_limits/api_keys durability survives failover.</w:t>
             </w:r>
           </w:p>
         </w:tc>
@@ -1280,7 +1312,7 @@
           </w:tcPr>
           <w:p>
             <w:r>
-              <w:t xml:space="preserve">k6's scripting supports multiple concurrent named client profiles at their distinct limits in one script, directly proving several requirements (per-client limits, latency, correctness) together. The chaos scenario is fully automated (container stop/start scripted into the pipeline, not a manual README step) so the fail-safe requirement — arguably the hardest one to trust without proof — is verified by a running test, not by inspection.</w:t>
+              <w:t>k6's scripting supports multiple concurrent named client profiles at their distinct limits in one script, directly proving several requirements (per-client limits, latency, correctness) together. The chaos scenario is fully automated (container stop/start scripted into the pipeline, not a manual README step) so the fail-safe requirement — arguably the hardest one to trust without proof — is verified by a running test, not by inspection. Latency is asserted in two tiers: k6 end-to-end p95 &lt; 10ms / p99 &lt; 20ms through nginx, and a server-side p99 &lt; 5ms histogram exported by each service to Prometheus.</w:t>
             </w:r>
           </w:p>
         </w:tc>
@@ -1502,7 +1534,7 @@
         <w:spacing w:after="60"/>
       </w:pPr>
       <w:r>
-        <w:t xml:space="preserve">remaining: &lt;integer&gt; — lets calling microservices self-throttle proactively rather than only reacting to rejections.</w:t>
+        <w:t>remaining: &lt;integer&gt; — lets calling microservices self-throttle proactively rather than only reacting to rejections. It reports the current bucket level (burst capacity), not a rate-window count.</w:t>
       </w:r>
     </w:p>
     <w:p>
@@ -1549,7 +1581,7 @@
         <w:spacing w:after="60"/>
       </w:pPr>
       <w:r>
-        <w:t xml:space="preserve">Retry-After header — populated directly from GCRA's computed next-allowed time, at no extra computation cost.</w:t>
+        <w:t>Retry-After header — populated directly from GCRA's computed next-allowed time, at no extra computation cost. reset_at is the time the bucket is expected to hold the requested cost again.</w:t>
       </w:r>
     </w:p>
     <w:p>
@@ -1631,20 +1663,20 @@
         <w:spacing w:after="60"/>
       </w:pPr>
       <w:r>
-        <w:t xml:space="preserve">PUT /admin/clients/{client_id}/limits — set rate, period, and burst. Also resets that client's GCRA state key.</w:t>
-      </w:r>
-    </w:p>
-    <w:p>
-      <w:pPr>
-        <w:pStyle w:val="ListParagraph"/>
-        <w:numPr>
-          <w:ilvl w:val="0"/>
-          <w:numId w:val="1"/>
-        </w:numPr>
-        <w:spacing w:after="60"/>
-      </w:pPr>
-      <w:r>
-        <w:t xml:space="preserve">DELETE /admin/clients/{client_id} — revoke a client (removes limit config and API-key mapping).</w:t>
+        <w:t>PUT /admin/clients/{client_id}/limits — set rate, period, and burst. Also resets that client's GCRA state key. The limits write and the GCRA-state reset are one atomic transaction (MULTI/EXEC).</w:t>
+      </w:r>
+    </w:p>
+    <w:p>
+      <w:pPr>
+        <w:pStyle w:val="ListParagraph"/>
+        <w:numPr>
+          <w:ilvl w:val="0"/>
+          <w:numId w:val="1"/>
+        </w:numPr>
+        <w:spacing w:after="60"/>
+      </w:pPr>
+      <w:r>
+        <w:t>DELETE /admin/clients/{client_id} — revoke a client (removes limit config and API-key mapping). Also removes the client's GCRA state key; historical TimescaleDB analytics are retained as an audit trail.</w:t>
       </w:r>
     </w:p>
     <w:p>
@@ -1867,6 +1899,50 @@
           <w:p>
             <w:r>
               <w:t xml:space="preserve">Redis Sentinel (quorum-based failover), 3x rate-limiter replicas behind nginx, health-checked Compose startup.</w:t>
+            </w:r>
+          </w:p>
+        </w:tc>
+      </w:tr>
+      <w:tr>
+        <w:tc>
+          <w:tcPr>
+            <w:tcW w:type="dxa" w:w="4000"/>
+          </w:tcPr>
+          <w:p>
+            <w:r>
+              <w:t>No duplicate or lost billing rows on consumer crash</w:t>
+            </w:r>
+          </w:p>
+        </w:tc>
+        <w:tc>
+          <w:tcPr>
+            <w:tcW w:type="dxa" w:w="5360"/>
+          </w:tcPr>
+          <w:p>
+            <w:r>
+              <w:t>At-least-once Streams delivery with idempotent TimescaleDB writes keyed on the stream entry ID.</w:t>
+            </w:r>
+          </w:p>
+        </w:tc>
+      </w:tr>
+      <w:tr>
+        <w:tc>
+          <w:tcPr>
+            <w:tcW w:type="dxa" w:w="4000"/>
+          </w:tcPr>
+          <w:p>
+            <w:r>
+              <w:t>Client secrets not stored in plaintext</w:t>
+            </w:r>
+          </w:p>
+        </w:tc>
+        <w:tc>
+          <w:tcPr>
+            <w:tcW w:type="dxa" w:w="5360"/>
+          </w:tcPr>
+          <w:p>
+            <w:r>
+              <w:t>API keys stored as SHA-256 hashes in Redis.</w:t>
             </w:r>
           </w:p>
         </w:tc>

</xml_diff>